<commit_message>
fix final heatmap figure
</commit_message>
<xml_diff>
--- a/baltic/drafts/BioRxiv/MS-warming-size-spectrum-model.docx
+++ b/baltic/drafts/BioRxiv/MS-warming-size-spectrum-model.docx
@@ -11429,7 +11429,14 @@
         <w:rPr>
           <w:rFonts w:ascii="Times" w:hAnsi="Times"/>
         </w:rPr>
-        <w:t>. Reproduction is given by the total egg production in numbers, which is the integral of the energy allocated to reproduction multiplied by a reproduction efficiency factor (</w:t>
+        <w:t xml:space="preserve">. Reproduction is given by the total egg production in numbers, which is the integral of the energy allocated to reproduction multiplied by a reproduction </w:t>
+      </w:r>
+      <w:r>
+        <w:rPr>
+          <w:rFonts w:ascii="Times" w:hAnsi="Times"/>
+        </w:rPr>
+        <w:lastRenderedPageBreak/>
+        <w:t>efficiency factor (</w:t>
       </w:r>
       <m:oMath>
         <m:r>
@@ -29134,10 +29141,10 @@
         </w:rPr>
         <w:lastRenderedPageBreak/>
         <w:drawing>
-          <wp:inline distT="0" distB="0" distL="0" distR="0" wp14:anchorId="72F09F8F" wp14:editId="2DD0E465">
-            <wp:extent cx="5731235" cy="3881336"/>
+          <wp:inline distT="0" distB="0" distL="0" distR="0" wp14:anchorId="08987FBA" wp14:editId="30EE73E9">
+            <wp:extent cx="5731510" cy="3881336"/>
             <wp:effectExtent l="0" t="0" r="0" b="5080"/>
-            <wp:docPr id="2" name="Picture 2" descr="Diagram&#10;&#10;Description automatically generated with medium confidence"/>
+            <wp:docPr id="3" name="Picture 3" descr="Diagram, treemap chart&#10;&#10;Description automatically generated"/>
             <wp:cNvGraphicFramePr>
               <a:graphicFrameLocks xmlns:a="http://schemas.openxmlformats.org/drawingml/2006/main" noChangeAspect="1"/>
             </wp:cNvGraphicFramePr>
@@ -29145,7 +29152,7 @@
               <a:graphicData uri="http://schemas.openxmlformats.org/drawingml/2006/picture">
                 <pic:pic xmlns:pic="http://schemas.openxmlformats.org/drawingml/2006/picture">
                   <pic:nvPicPr>
-                    <pic:cNvPr id="2" name="Picture 2" descr="Diagram&#10;&#10;Description automatically generated with medium confidence"/>
+                    <pic:cNvPr id="3" name="Picture 3" descr="Diagram, treemap chart&#10;&#10;Description automatically generated"/>
                     <pic:cNvPicPr/>
                   </pic:nvPicPr>
                   <pic:blipFill rotWithShape="1">
@@ -29156,13 +29163,13 @@
                         </a:ext>
                       </a:extLst>
                     </a:blip>
-                    <a:srcRect t="16293" b="15984"/>
+                    <a:srcRect t="15953" b="16327"/>
                     <a:stretch/>
                   </pic:blipFill>
                   <pic:spPr bwMode="auto">
                     <a:xfrm>
                       <a:off x="0" y="0"/>
-                      <a:ext cx="5731510" cy="3881522"/>
+                      <a:ext cx="5731510" cy="3881336"/>
                     </a:xfrm>
                     <a:prstGeom prst="rect">
                       <a:avLst/>
@@ -29194,7 +29201,6 @@
           <w:szCs w:val="22"/>
         </w:rPr>
       </w:pPr>
-      <w:commentRangeStart w:id="7"/>
       <w:r>
         <w:rPr>
           <w:i/>
@@ -29220,23 +29226,7 @@
           <w:sz w:val="22"/>
           <w:szCs w:val="22"/>
         </w:rPr>
-        <w:t xml:space="preserve">. </w:t>
-      </w:r>
-      <w:commentRangeEnd w:id="7"/>
-      <w:r>
-        <w:rPr>
-          <w:rStyle w:val="CommentReference"/>
-        </w:rPr>
-        <w:commentReference w:id="7"/>
-      </w:r>
-      <w:r>
-        <w:rPr>
-          <w:i/>
-          <w:iCs/>
-          <w:sz w:val="22"/>
-          <w:szCs w:val="22"/>
-        </w:rPr>
-        <w:t xml:space="preserve">Example of fisheries yield at steady state relative to MSY at </w:t>
+        <w:t xml:space="preserve">. Example of fisheries yield at steady state relative to MSY at </w:t>
       </w:r>
       <m:oMath>
         <m:sSub>
@@ -29308,7 +29298,7 @@
           <w:sz w:val="22"/>
           <w:szCs w:val="22"/>
         </w:rPr>
-        <w:t xml:space="preserve"> simulations with constant (not time-varying) temperatures</w:t>
+        <w:t xml:space="preserve"> simulations with </w:t>
       </w:r>
       <w:r>
         <w:rPr>
@@ -29317,7 +29307,7 @@
           <w:sz w:val="22"/>
           <w:szCs w:val="22"/>
         </w:rPr>
-        <w:t xml:space="preserve"> </w:t>
+        <w:t>constant (not time-varying) temperatures</w:t>
       </w:r>
       <w:r>
         <w:rPr>
@@ -29326,7 +29316,7 @@
           <w:sz w:val="22"/>
           <w:szCs w:val="22"/>
         </w:rPr>
-        <w:t xml:space="preserve">with the three temperature dependence </w:t>
+        <w:t xml:space="preserve"> </w:t>
       </w:r>
       <w:r>
         <w:rPr>
@@ -29335,7 +29325,7 @@
           <w:sz w:val="22"/>
           <w:szCs w:val="22"/>
         </w:rPr>
-        <w:t>scenarios</w:t>
+        <w:t xml:space="preserve">with the three temperature dependence </w:t>
       </w:r>
       <w:r>
         <w:rPr>
@@ -29344,7 +29334,7 @@
           <w:sz w:val="22"/>
           <w:szCs w:val="22"/>
         </w:rPr>
-        <w:t xml:space="preserve"> (</w:t>
+        <w:t>scenarios</w:t>
       </w:r>
       <w:r>
         <w:rPr>
@@ -29353,7 +29343,7 @@
           <w:sz w:val="22"/>
           <w:szCs w:val="22"/>
         </w:rPr>
-        <w:t>columns</w:t>
+        <w:t xml:space="preserve"> (</w:t>
       </w:r>
       <w:r>
         <w:rPr>
@@ -29362,7 +29352,7 @@
           <w:sz w:val="22"/>
           <w:szCs w:val="22"/>
         </w:rPr>
-        <w:t>)</w:t>
+        <w:t>columns</w:t>
       </w:r>
       <w:r>
         <w:rPr>
@@ -29371,7 +29361,7 @@
           <w:sz w:val="22"/>
           <w:szCs w:val="22"/>
         </w:rPr>
-        <w:t>.</w:t>
+        <w:t>)</w:t>
       </w:r>
       <w:r>
         <w:rPr>
@@ -29380,7 +29370,7 @@
           <w:sz w:val="22"/>
           <w:szCs w:val="22"/>
         </w:rPr>
-        <w:t xml:space="preserve"> </w:t>
+        <w:t>.</w:t>
       </w:r>
       <w:r>
         <w:rPr>
@@ -29389,36 +29379,25 @@
           <w:sz w:val="22"/>
           <w:szCs w:val="22"/>
         </w:rPr>
-        <w:t xml:space="preserve">The </w:t>
-      </w:r>
-      <w:commentRangeStart w:id="8"/>
-      <w:r>
-        <w:rPr>
-          <w:i/>
-          <w:iCs/>
-          <w:color w:val="FF0000"/>
+        <w:t xml:space="preserve"> </w:t>
+      </w:r>
+      <w:r>
+        <w:rPr>
+          <w:i/>
+          <w:iCs/>
           <w:sz w:val="22"/>
           <w:szCs w:val="22"/>
         </w:rPr>
-        <w:t>y</w:t>
-      </w:r>
-      <w:r>
-        <w:rPr>
-          <w:i/>
-          <w:iCs/>
-          <w:color w:val="FF0000"/>
+        <w:t xml:space="preserve">The </w:t>
+      </w:r>
+      <w:r>
+        <w:rPr>
+          <w:i/>
+          <w:iCs/>
           <w:sz w:val="22"/>
           <w:szCs w:val="22"/>
         </w:rPr>
-        <w:t xml:space="preserve">-axis </w:t>
-      </w:r>
-      <w:commentRangeEnd w:id="8"/>
-      <w:r>
-        <w:rPr>
-          <w:rStyle w:val="CommentReference"/>
-          <w:color w:val="FF0000"/>
-        </w:rPr>
-        <w:commentReference w:id="8"/>
+        <w:t>y</w:t>
       </w:r>
       <w:r>
         <w:rPr>
@@ -29427,7 +29406,7 @@
           <w:sz w:val="22"/>
           <w:szCs w:val="22"/>
         </w:rPr>
-        <w:t xml:space="preserve">shows fishing mortality, </w:t>
+        <w:t xml:space="preserve">-axis shows fishing mortality, </w:t>
       </w:r>
       <m:oMath>
         <m:r>
@@ -29540,7 +29519,6 @@
         <w:rPr>
           <w:i/>
           <w:iCs/>
-          <w:color w:val="FF0000"/>
           <w:sz w:val="22"/>
           <w:szCs w:val="22"/>
         </w:rPr>
@@ -29550,11 +29528,10 @@
         <w:rPr>
           <w:i/>
           <w:iCs/>
-          <w:color w:val="FF0000"/>
           <w:sz w:val="22"/>
           <w:szCs w:val="22"/>
         </w:rPr>
-        <w:t xml:space="preserve">-axis </w:t>
+        <w:t xml:space="preserve">-axis shows </w:t>
       </w:r>
       <w:r>
         <w:rPr>
@@ -29563,7 +29540,7 @@
           <w:sz w:val="22"/>
           <w:szCs w:val="22"/>
         </w:rPr>
-        <w:t xml:space="preserve">shows temperature as a proportion of </w:t>
+        <w:t xml:space="preserve">temperature as a proportion of </w:t>
       </w:r>
       <m:oMath>
         <m:sSub>
@@ -30303,115 +30280,6 @@
       </w:r>
     </w:p>
   </w:comment>
-  <w:comment w:id="7" w:author="Max Lindmark" w:date="2021-09-24T15:01:00Z" w:initials="MOU">
-    <w:p>
-      <w:pPr>
-        <w:pStyle w:val="CommentText"/>
-      </w:pPr>
-      <w:r>
-        <w:rPr>
-          <w:rStyle w:val="CommentReference"/>
-        </w:rPr>
-        <w:annotationRef/>
-      </w:r>
-      <w:r>
-        <w:t xml:space="preserve">I’m running models now on a finer grid, so I will replace the grey dots with </w:t>
-      </w:r>
-      <w:r>
-        <w:t>a dashed red line that indicates FMSY</w:t>
-      </w:r>
-      <w:r>
-        <w:t>.</w:t>
-      </w:r>
-    </w:p>
-  </w:comment>
-  <w:comment w:id="8" w:author="Max Lindmark" w:date="2021-09-24T15:11:00Z" w:initials="MOU">
-    <w:p>
-      <w:pPr>
-        <w:pStyle w:val="CommentText"/>
-      </w:pPr>
-      <w:r>
-        <w:rPr>
-          <w:rStyle w:val="CommentReference"/>
-        </w:rPr>
-        <w:annotationRef/>
-      </w:r>
-      <w:r>
-        <w:t>I LABELLED THEM WRONG; WAITING FOR SIMULATIONS TO FINISH. X IS TEMPERTURE TO MORE EASILY SEE HOW TO GREY POINTS (FMSY) CHANGE WITH TEMP!!!</w:t>
-      </w:r>
-    </w:p>
-    <w:p>
-      <w:pPr>
-        <w:pStyle w:val="CommentText"/>
-      </w:pPr>
-    </w:p>
-    <w:p>
-      <w:pPr>
-        <w:pStyle w:val="CommentText"/>
-      </w:pPr>
-      <w:r>
-        <w:t xml:space="preserve">I will </w:t>
-      </w:r>
-      <w:r>
-        <w:t>change the axis title to “…</w:t>
-      </w:r>
-      <w:r>
-        <w:rPr>
-          <w:i/>
-          <w:iCs/>
-          <w:sz w:val="22"/>
-          <w:szCs w:val="22"/>
-        </w:rPr>
-        <w:t xml:space="preserve">, </w:t>
-      </w:r>
-      <m:oMath>
-        <m:sSub>
-          <m:sSubPr>
-            <m:ctrlPr>
-              <w:rPr>
-                <w:rFonts w:ascii="Cambria Math" w:hAnsi="Cambria Math"/>
-                <w:i/>
-                <w:iCs/>
-                <w:sz w:val="22"/>
-                <w:szCs w:val="22"/>
-              </w:rPr>
-            </m:ctrlPr>
-          </m:sSubPr>
-          <m:e>
-            <m:r>
-              <w:rPr>
-                <w:rFonts w:ascii="Cambria Math" w:hAnsi="Cambria Math"/>
-                <w:sz w:val="22"/>
-                <w:szCs w:val="22"/>
-              </w:rPr>
-              <m:t>F</m:t>
-            </m:r>
-          </m:e>
-          <m:sub>
-            <m:r>
-              <w:rPr>
-                <w:rFonts w:ascii="Cambria Math" w:hAnsi="Cambria Math"/>
-                <w:sz w:val="22"/>
-                <w:szCs w:val="22"/>
-              </w:rPr>
-              <m:t>MSY</m:t>
-            </m:r>
-          </m:sub>
-        </m:sSub>
-        <m:r>
-          <w:rPr>
-            <w:rFonts w:ascii="Cambria Math" w:hAnsi="Cambria Math"/>
-            <w:sz w:val="22"/>
-            <w:szCs w:val="22"/>
-          </w:rPr>
-          <m:t>…</m:t>
-        </m:r>
-      </m:oMath>
-      <w:r>
-        <w:t>)</w:t>
-      </w:r>
-    </w:p>
-  </w:comment>
 </w:comments>
 </file>
 
@@ -30423,8 +30291,6 @@
   <w15:commentEx w15:paraId="119A1D0A" w15:paraIdParent="483E9835" w15:done="0"/>
   <w15:commentEx w15:paraId="1DFC2845" w15:done="0"/>
   <w15:commentEx w15:paraId="62941D49" w15:paraIdParent="1DFC2845" w15:done="0"/>
-  <w15:commentEx w15:paraId="2D3283FF" w15:done="0"/>
-  <w15:commentEx w15:paraId="326F33AD" w15:done="0"/>
 </w15:commentsEx>
 </file>
 
@@ -30435,8 +30301,6 @@
   <w16cex:commentExtensible w16cex:durableId="249B2D20" w16cex:dateUtc="2021-07-15T18:54:00Z"/>
   <w16cex:commentExtensible w16cex:durableId="24F5E192" w16cex:dateUtc="2021-09-22T15:08:00Z"/>
   <w16cex:commentExtensible w16cex:durableId="24F70AC7" w16cex:dateUtc="2021-09-23T12:16:00Z"/>
-  <w16cex:commentExtensible w16cex:durableId="24F866E2" w16cex:dateUtc="2021-09-24T13:01:00Z"/>
-  <w16cex:commentExtensible w16cex:durableId="24F86913" w16cex:dateUtc="2021-09-24T13:11:00Z"/>
 </w16cex:commentsExtensible>
 </file>
 
@@ -30448,8 +30312,6 @@
   <w16cid:commentId w16cid:paraId="119A1D0A" w16cid:durableId="24F5E192"/>
   <w16cid:commentId w16cid:paraId="1DFC2845" w16cid:durableId="24F5B1A0"/>
   <w16cid:commentId w16cid:paraId="62941D49" w16cid:durableId="24F70AC7"/>
-  <w16cid:commentId w16cid:paraId="2D3283FF" w16cid:durableId="24F866E2"/>
-  <w16cid:commentId w16cid:paraId="326F33AD" w16cid:durableId="24F86913"/>
 </w16cid:commentsIds>
 </file>
 

</xml_diff>